<commit_message>
Publish formal English documentation and examples for renamed skill repository
</commit_message>
<xml_diff>
--- a/examples/style-demo.docx
+++ b/examples/style-demo.docx
@@ -199,10 +199,10 @@
         <w:jc w:val="left"/>
         <w:rPr>
           <w:rFonts w:ascii="Abadi MT Condensed Light" w:hAnsi="Abadi MT Condensed Light" w:eastAsiaTheme="majorHAnsi"/>
-          <w:b w:val="1"/>
-          <w:bCs w:val="1"/>
-          <w:sz w:val="11"/>
-          <w:szCs w:val="11"/>
+          <w:b w:val="0"/>
+          <w:bCs w:val="0"/>
+          <w:sz w:val="13"/>
+          <w:szCs w:val="13"/>
         </w:rPr>
       </w:pPr>
       <w:r>
@@ -264,18 +264,7 @@
           <w:bCs w:val="0"/>
           <w:color w:val="000000"/>
         </w:rPr>
-        <w:t xml:space="preserve"> First supporting point. </w:t>
-      </w:r>
-      <w:r>
-        <w:rPr>
-          <w:rFonts w:ascii="Abadi MT Condensed Light" w:hAnsi="Abadi MT Condensed Light" w:eastAsiaTheme="majorHAnsi"/>
-          <w:sz w:val="11"/>
-          <w:szCs w:val="11"/>
-          <w:b w:val="1"/>
-          <w:bCs w:val="1"/>
-          <w:color w:val="000000"/>
-        </w:rPr>
-        <w:t>简短理解提示。</w:t>
+        <w:t xml:space="preserve"> First supporting point with a concise explanation.</w:t>
       </w:r>
     </w:p>
     <w:p>
@@ -534,22 +523,22 @@
         <w:jc w:val="left"/>
         <w:rPr>
           <w:rFonts w:ascii="Abadi MT Condensed Light" w:hAnsi="Abadi MT Condensed Light" w:eastAsiaTheme="majorHAnsi"/>
-          <w:b w:val="1"/>
-          <w:bCs w:val="1"/>
-          <w:sz w:val="11"/>
-          <w:szCs w:val="11"/>
+          <w:b w:val="0"/>
+          <w:bCs w:val="0"/>
+          <w:sz w:val="13"/>
+          <w:szCs w:val="13"/>
         </w:rPr>
       </w:pPr>
       <w:r>
         <w:rPr>
           <w:rFonts w:ascii="Abadi MT Condensed Light" w:hAnsi="Abadi MT Condensed Light" w:eastAsiaTheme="majorHAnsi"/>
-          <w:sz w:val="11"/>
-          <w:szCs w:val="11"/>
-          <w:b w:val="1"/>
-          <w:bCs w:val="1"/>
+          <w:sz w:val="13"/>
+          <w:szCs w:val="13"/>
+          <w:b w:val="0"/>
+          <w:bCs w:val="0"/>
           <w:color w:val="000000"/>
         </w:rPr>
-        <w:t>中文仅作简短提示，不重复翻译全部英文。</w:t>
+        <w:t>Use concise annotations only when they improve clarity.</w:t>
       </w:r>
     </w:p>
     <w:p>
@@ -27462,13 +27451,13 @@
     </a:clrScheme>
     <a:fontScheme name="Office">
       <a:majorFont>
-        <a:latin typeface="等线 Light" panose="02110004020202020204"/>
+        <a:latin typeface="DengXian Light" panose="02110004020202020204"/>
         <a:ea typeface=""/>
         <a:cs typeface=""/>
         <a:font script="Jpan" typeface="ＭＳ ゴシック"/>
         <a:font script="Hang" typeface="맑은 고딕"/>
-        <a:font script="Hans" typeface="等线 Light"/>
-        <a:font script="Hant" typeface="新細明體"/>
+        <a:font script="Hans" typeface="DengXian Light"/>
+        <a:font script="Hant" typeface="PMingLiU"/>
         <a:font script="Arab" typeface="Times New Roman"/>
         <a:font script="Hebr" typeface="Times New Roman"/>
         <a:font script="Thai" typeface="Angsana New"/>
@@ -27497,13 +27486,13 @@
         <a:font script="Geor" typeface="Sylfaen"/>
       </a:majorFont>
       <a:minorFont>
-        <a:latin typeface="等线" panose="02110004020202020204"/>
+        <a:latin typeface="DengXian" panose="02110004020202020204"/>
         <a:ea typeface=""/>
         <a:cs typeface=""/>
-        <a:font script="Jpan" typeface="ＭＳ 明朝"/>
+        <a:font script="Jpan" typeface="MS Mincho"/>
         <a:font script="Hang" typeface="맑은 고딕"/>
-        <a:font script="Hans" typeface="等线"/>
-        <a:font script="Hant" typeface="新細明體"/>
+        <a:font script="Hans" typeface="DengXian"/>
+        <a:font script="Hant" typeface="PMingLiU"/>
         <a:font script="Arab" typeface="Arial"/>
         <a:font script="Hebr" typeface="Arial"/>
         <a:font script="Thai" typeface="Cordia New"/>

</xml_diff>